<commit_message>
auto(daily): dev loop report 2026-06-14
</commit_message>
<xml_diff>
--- a/reports/hypothesis/2026-06-14.docx
+++ b/reports/hypothesis/2026-06-14.docx
@@ -15,7 +15,7 @@
         <w:rPr>
           <w:i/>
         </w:rPr>
-        <w:t>생성일: 2026-06-14 09:15 KST  |  표본: 측정소당 최소 2484건 / 총 12595건</w:t>
+        <w:t>생성일: 2026-06-14 14:04 KST  |  표본: 측정소당 최소 2489건 / 총 12620건</w:t>
       </w:r>
     </w:p>
     <w:p>
@@ -143,7 +143,7 @@
           </w:tcPr>
           <w:p>
             <w:r>
-              <w:t>36.605</w:t>
+              <w:t>36.584</w:t>
             </w:r>
           </w:p>
         </w:tc>
@@ -153,7 +153,7 @@
           </w:tcPr>
           <w:p>
             <w:r>
-              <w:t>33.539</w:t>
+              <w:t>33.521</w:t>
             </w:r>
           </w:p>
         </w:tc>
@@ -163,7 +163,7 @@
           </w:tcPr>
           <w:p>
             <w:r>
-              <w:t>+3.066</w:t>
+              <w:t>+3.063</w:t>
             </w:r>
           </w:p>
         </w:tc>
@@ -215,7 +215,7 @@
           </w:tcPr>
           <w:p>
             <w:r>
-              <w:t>20.453</w:t>
+              <w:t>20.449</w:t>
             </w:r>
           </w:p>
         </w:tc>
@@ -225,7 +225,7 @@
           </w:tcPr>
           <w:p>
             <w:r>
-              <w:t>17.552</w:t>
+              <w:t>17.549</w:t>
             </w:r>
           </w:p>
         </w:tc>
@@ -235,7 +235,7 @@
           </w:tcPr>
           <w:p>
             <w:r>
-              <w:t>+2.901</w:t>
+              <w:t>+2.899</w:t>
             </w:r>
           </w:p>
         </w:tc>
@@ -660,7 +660,7 @@
           </w:tcPr>
           <w:p>
             <w:r>
-              <w:t>32.06</w:t>
+              <w:t>32.13</w:t>
             </w:r>
           </w:p>
         </w:tc>
@@ -722,7 +722,7 @@
           </w:tcPr>
           <w:p>
             <w:r>
-              <w:t>79.30</w:t>
+              <w:t>79.62</w:t>
             </w:r>
           </w:p>
         </w:tc>
@@ -784,7 +784,7 @@
           </w:tcPr>
           <w:p>
             <w:r>
-              <w:t>12.13</w:t>
+              <w:t>12.25</w:t>
             </w:r>
           </w:p>
         </w:tc>
@@ -846,7 +846,7 @@
           </w:tcPr>
           <w:p>
             <w:r>
-              <w:t>162.14</w:t>
+              <w:t>162.57</w:t>
             </w:r>
           </w:p>
         </w:tc>
@@ -908,7 +908,7 @@
           </w:tcPr>
           <w:p>
             <w:r>
-              <w:t>65.82</w:t>
+              <w:t>65.77</w:t>
             </w:r>
           </w:p>
         </w:tc>
@@ -970,7 +970,7 @@
           </w:tcPr>
           <w:p>
             <w:r>
-              <w:t>143.62</w:t>
+              <w:t>144.11</w:t>
             </w:r>
           </w:p>
         </w:tc>

</xml_diff>